<commit_message>
fix: preserva timestamps no split temporal
</commit_message>
<xml_diff>
--- a/reports/entrega_parcial_1.docx
+++ b/reports/entrega_parcial_1.docx
@@ -551,34 +551,10 @@
         <w:pStyle w:val="BodyText"/>
       </w:pPr>
       <w:r>
-        <w:t xml:space="preserve">Detalhamento completo da EDA, incluindo padrão de nulos e correlações, em</w:t>
-      </w:r>
-      <w:r>
-        <w:t xml:space="preserve"> </w:t>
-      </w:r>
-      <w:r>
-        <w:rPr>
-          <w:rStyle w:val="VerbatimChar"/>
-        </w:rPr>
-        <w:t xml:space="preserve">reports/pessoa_2/junho/04_entrega_parcial_eda_features.md</w:t>
-      </w:r>
-      <w:r>
-        <w:t xml:space="preserve"> </w:t>
-      </w:r>
-      <w:r>
-        <w:t xml:space="preserve">e</w:t>
-      </w:r>
-      <w:r>
-        <w:t xml:space="preserve"> </w:t>
-      </w:r>
-      <w:r>
-        <w:rPr>
-          <w:rStyle w:val="VerbatimChar"/>
-        </w:rPr>
-        <w:t xml:space="preserve">reports/eda_summary.txt</w:t>
-      </w:r>
-      <w:r>
-        <w:t xml:space="preserve">.</w:t>
+        <w:rPr>
+          <w:b w:val="0"/>
+        </w:rPr>
+        <w:t>Detalhamento completo da EDA, incluindo padrão de nulos e correlações, em reports/pessoa_2/junho/04_entrega_parcial_eda_features.md. O notebook notebooks/01_eda.ipynb também gera reports/eda_summary.txt localmente; esse arquivo é reproduzível e permanece fora do Git.</w:t>
       </w:r>
     </w:p>
     <w:p>
@@ -1008,12 +984,14 @@
       <w:r>
         <w:rPr>
           <w:b/>
-          <w:bCs/>
-        </w:rPr>
-        <w:t xml:space="preserve">A divisão é temporal, não aleatória</w:t>
-      </w:r>
-      <w:r>
-        <w:t xml:space="preserve">: as transações mais antigas formam o treino, as mais recentes o teste. Em detecção de fraude, só se tem o passado para prever o futuro; um sorteio aleatório permitiria ao modelo aprender padrões de datas posteriores às que ele tenta prever.</w:t>
+        </w:rPr>
+        <w:t xml:space="preserve">A divisão é temporal, não aleatória: </w:t>
+      </w:r>
+      <w:r>
+        <w:rPr>
+          <w:b w:val="0"/>
+        </w:rPr>
+        <w:t>as transações mais antigas formam o treino, as mais recentes o teste. Em detecção de fraude, só se tem o passado para prever o futuro; um sorteio aleatório permitiria ao modelo aprender padrões de datas posteriores às que ele tenta prever. Se a posição nominal de uma fronteira cair dentro de um grupo com o mesmo TransactionDT, o corte avança até a próxima mudança de timestamp. Isso impede que eventos simultâneos sejam separados, tornando as proporções aproximadamente — e não obrigatoriamente exatamente — 70/15/15.</w:t>
       </w:r>
     </w:p>
     <w:p>
@@ -1820,23 +1798,16 @@
         <w:pStyle w:val="FirstParagraph"/>
       </w:pPr>
       <w:r>
-        <w:t xml:space="preserve">O que se degrada é a</w:t>
-      </w:r>
-      <w:r>
-        <w:t xml:space="preserve"> </w:t>
-      </w:r>
-      <w:r>
         <w:rPr>
           <w:b/>
-          <w:bCs/>
-        </w:rPr>
-        <w:t xml:space="preserve">pureza das previsões de maior confiança</w:t>
-      </w:r>
-      <w:r>
-        <w:t xml:space="preserve"> </w:t>
-      </w:r>
-      <w:r>
-        <w:t xml:space="preserve">no período mais recente. Os padrões aprendidos no passado envelhecem.</w:t>
+        </w:rPr>
+        <w:t xml:space="preserve">O que se degrada é a pureza das previsões de maior confiança </w:t>
+      </w:r>
+      <w:r>
+        <w:rPr>
+          <w:b w:val="0"/>
+        </w:rPr>
+        <w:t>no período mais recente. O comportamento é compatível com envelhecimento dos padrões, embora o experimento isolado não identifique sozinho a causa da mudança.</w:t>
       </w:r>
     </w:p>
     <w:p>
@@ -1844,20 +1815,16 @@
         <w:pStyle w:val="BodyText"/>
       </w:pPr>
       <w:r>
-        <w:t xml:space="preserve">Esse resultado</w:t>
-      </w:r>
-      <w:r>
-        <w:t xml:space="preserve"> </w:t>
-      </w:r>
-      <w:r>
         <w:rPr>
           <w:b/>
-          <w:bCs/>
-        </w:rPr>
-        <w:t xml:space="preserve">só é observável por causa da divisão temporal</w:t>
-      </w:r>
-      <w:r>
-        <w:t xml:space="preserve">. Uma divisão aleatória teria misturado os períodos e reportado ~0,39 como desempenho do modelo — errando por um fator de dois. É evidência interna, produzida pelo próprio experimento, para a escolha metodológica adotada, e indica que um sistema como este exigiria retreino periódico em operação.</w:t>
+        </w:rPr>
+        <w:t xml:space="preserve">Esse contraste só é observável porque validação e teste preservam períodos distintos. </w:t>
+      </w:r>
+      <w:r>
+        <w:rPr>
+          <w:b w:val="0"/>
+        </w:rPr>
+        <w:t>Uma divisão aleatória misturaria os períodos e poderia mascarar parte da degradação. Como não foi executado um controle aleatório no dataset completo, não se atribui a ele uma AUC-PR específica. O resultado é evidência interna para a escolha metodológica e indica que um sistema operacional exigiria monitoramento temporal e critérios de retreino.</w:t>
       </w:r>
     </w:p>
     <w:p>

</xml_diff>